<commit_message>
Configuration de application.properties pour utiliser les services de AWS
</commit_message>
<xml_diff>
--- a/project-PAAS-SAAS-section-15.docx
+++ b/project-PAAS-SAAS-section-15.docx
@@ -4,31 +4,7 @@
   <w:body>
     <w:p>
       <w:r>
-        <w:t xml:space="preserve">Cette documentation est faite pour décrire les étapes du </w:t>
-      </w:r>
-      <w:proofErr w:type="spellStart"/>
-      <w:r>
-        <w:t>deploiement</w:t>
-      </w:r>
-      <w:proofErr w:type="spellEnd"/>
-      <w:r>
-        <w:t xml:space="preserve"> de </w:t>
-      </w:r>
-      <w:proofErr w:type="spellStart"/>
-      <w:r>
-        <w:t>vprofile</w:t>
-      </w:r>
-      <w:proofErr w:type="spellEnd"/>
-      <w:r>
-        <w:t xml:space="preserve"> sur AWS en utilisant les services fournis par </w:t>
-      </w:r>
-      <w:proofErr w:type="spellStart"/>
-      <w:r>
-        <w:t>Beanstalk</w:t>
-      </w:r>
-      <w:proofErr w:type="spellEnd"/>
-      <w:r>
-        <w:t>.</w:t>
+        <w:t>Cette documentation est faite pour décrire les étapes du deploiement de vprofile sur AWS en utilisant les services fournis par Beanstalk.</w:t>
       </w:r>
     </w:p>
     <w:p/>
@@ -43,49 +19,7 @@
         <w:rPr>
           <w:lang w:val="en-US"/>
         </w:rPr>
-        <w:t xml:space="preserve">Create a security group for the </w:t>
-      </w:r>
-      <w:proofErr w:type="spellStart"/>
-      <w:r>
-        <w:rPr>
-          <w:lang w:val="en-US"/>
-        </w:rPr>
-        <w:t>bakend</w:t>
-      </w:r>
-      <w:proofErr w:type="spellEnd"/>
-      <w:r>
-        <w:rPr>
-          <w:lang w:val="en-US"/>
-        </w:rPr>
-        <w:t xml:space="preserve">, this security group is named </w:t>
-      </w:r>
-      <w:proofErr w:type="spellStart"/>
-      <w:r>
-        <w:rPr>
-          <w:lang w:val="en-US"/>
-        </w:rPr>
-        <w:t>vprofile</w:t>
-      </w:r>
-      <w:proofErr w:type="spellEnd"/>
-      <w:r>
-        <w:rPr>
-          <w:lang w:val="en-US"/>
-        </w:rPr>
-        <w:t>-</w:t>
-      </w:r>
-      <w:proofErr w:type="spellStart"/>
-      <w:r>
-        <w:rPr>
-          <w:lang w:val="en-US"/>
-        </w:rPr>
-        <w:t>rearch</w:t>
-      </w:r>
-      <w:proofErr w:type="spellEnd"/>
-      <w:r>
-        <w:rPr>
-          <w:lang w:val="en-US"/>
-        </w:rPr>
-        <w:t>-backend-sg</w:t>
+        <w:t>Create a security group for the bakend, this security group is named vprofile-rearch-backend-sg</w:t>
       </w:r>
     </w:p>
     <w:p>
@@ -113,35 +47,7 @@
         <w:rPr>
           <w:lang w:val="en-US"/>
         </w:rPr>
-        <w:t xml:space="preserve">Create a key pair : </w:t>
-      </w:r>
-      <w:proofErr w:type="spellStart"/>
-      <w:r>
-        <w:rPr>
-          <w:lang w:val="en-US"/>
-        </w:rPr>
-        <w:t>vprofile</w:t>
-      </w:r>
-      <w:proofErr w:type="spellEnd"/>
-      <w:r>
-        <w:rPr>
-          <w:lang w:val="en-US"/>
-        </w:rPr>
-        <w:t>-</w:t>
-      </w:r>
-      <w:proofErr w:type="spellStart"/>
-      <w:r>
-        <w:rPr>
-          <w:lang w:val="en-US"/>
-        </w:rPr>
-        <w:t>rearch</w:t>
-      </w:r>
-      <w:proofErr w:type="spellEnd"/>
-      <w:r>
-        <w:rPr>
-          <w:lang w:val="en-US"/>
-        </w:rPr>
-        <w:t>-key-pair</w:t>
+        <w:t>Create a key pair : vprofile-rearch-key-pair</w:t>
       </w:r>
     </w:p>
     <w:p>
@@ -196,6 +102,7 @@
       </w:pPr>
       <w:r>
         <w:rPr>
+          <w:noProof/>
           <w:lang w:val="en-US"/>
         </w:rPr>
         <w:drawing>
@@ -276,6 +183,7 @@
       </w:pPr>
       <w:r>
         <w:rPr>
+          <w:noProof/>
           <w:lang w:val="en-US"/>
         </w:rPr>
         <w:drawing>
@@ -426,17 +334,17 @@
       </w:r>
     </w:p>
     <w:p>
-      <w:r>
-        <w:t xml:space="preserve">DB instance identifier : </w:t>
-      </w:r>
-      <w:proofErr w:type="spellStart"/>
-      <w:r>
-        <w:t>vprofile-r</w:t>
-      </w:r>
-      <w:r>
-        <w:t>ds-rearch</w:t>
-      </w:r>
-      <w:proofErr w:type="spellEnd"/>
+      <w:pPr>
+        <w:rPr>
+          <w:lang w:val="en-US"/>
+        </w:rPr>
+      </w:pPr>
+      <w:r>
+        <w:rPr>
+          <w:lang w:val="en-US"/>
+        </w:rPr>
+        <w:t>DB instance identifier : vprofile-rds-rearch</w:t>
+      </w:r>
     </w:p>
     <w:p>
       <w:pPr>
@@ -506,49 +414,13 @@
         <w:rPr>
           <w:lang w:val="en-US"/>
         </w:rPr>
-        <w:t xml:space="preserve">VPC security group : the security </w:t>
-      </w:r>
-      <w:proofErr w:type="spellStart"/>
-      <w:r>
-        <w:rPr>
-          <w:lang w:val="en-US"/>
-        </w:rPr>
-        <w:t>groupe</w:t>
-      </w:r>
-      <w:proofErr w:type="spellEnd"/>
-      <w:r>
-        <w:rPr>
-          <w:lang w:val="en-US"/>
-        </w:rPr>
-        <w:t xml:space="preserve"> created above </w:t>
-      </w:r>
-      <w:proofErr w:type="spellStart"/>
-      <w:r>
-        <w:rPr>
-          <w:lang w:val="en-US"/>
-        </w:rPr>
-        <w:t>vprofile</w:t>
-      </w:r>
-      <w:proofErr w:type="spellEnd"/>
-      <w:r>
-        <w:rPr>
-          <w:lang w:val="en-US"/>
-        </w:rPr>
-        <w:t>-</w:t>
-      </w:r>
-      <w:proofErr w:type="spellStart"/>
-      <w:r>
-        <w:rPr>
-          <w:lang w:val="en-US"/>
-        </w:rPr>
-        <w:t>rearch</w:t>
-      </w:r>
-      <w:proofErr w:type="spellEnd"/>
-      <w:r>
-        <w:rPr>
-          <w:lang w:val="en-US"/>
-        </w:rPr>
-        <w:t>-backend-sg</w:t>
+        <w:t xml:space="preserve">VPC security group : the security groupe created above </w:t>
+      </w:r>
+      <w:r>
+        <w:rPr>
+          <w:lang w:val="en-US"/>
+        </w:rPr>
+        <w:t>vprofile-rearch-backend-sg</w:t>
       </w:r>
       <w:r>
         <w:rPr>
@@ -594,42 +466,20 @@
           <w:lang w:val="en-US"/>
         </w:rPr>
         <w:lastRenderedPageBreak/>
-        <w:t xml:space="preserve">Create an </w:t>
-      </w:r>
-      <w:proofErr w:type="spellStart"/>
-      <w:r>
-        <w:rPr>
-          <w:lang w:val="en-US"/>
-        </w:rPr>
-        <w:t>ElastiCache</w:t>
-      </w:r>
-      <w:proofErr w:type="spellEnd"/>
-    </w:p>
-    <w:p>
-      <w:pPr>
-        <w:rPr>
-          <w:lang w:val="en-US"/>
-        </w:rPr>
-      </w:pPr>
-      <w:r>
-        <w:rPr>
-          <w:lang w:val="en-US"/>
-        </w:rPr>
-        <w:t xml:space="preserve">The creation of </w:t>
-      </w:r>
-      <w:proofErr w:type="spellStart"/>
-      <w:r>
-        <w:rPr>
-          <w:lang w:val="en-US"/>
-        </w:rPr>
-        <w:t>ElastiCache</w:t>
-      </w:r>
-      <w:proofErr w:type="spellEnd"/>
-      <w:r>
-        <w:rPr>
-          <w:lang w:val="en-US"/>
-        </w:rPr>
-        <w:t xml:space="preserve"> need the same steps of the RDS procedure</w:t>
+        <w:t>Create an ElastiCache</w:t>
+      </w:r>
+    </w:p>
+    <w:p>
+      <w:pPr>
+        <w:rPr>
+          <w:lang w:val="en-US"/>
+        </w:rPr>
+      </w:pPr>
+      <w:r>
+        <w:rPr>
+          <w:lang w:val="en-US"/>
+        </w:rPr>
+        <w:t>The creation of ElastiCache need the same steps of the RDS procedure</w:t>
       </w:r>
     </w:p>
     <w:p>
@@ -653,6 +503,7 @@
       </w:pPr>
       <w:r>
         <w:rPr>
+          <w:noProof/>
           <w:lang w:val="en-US"/>
         </w:rPr>
         <w:drawing>
@@ -713,6 +564,7 @@
       </w:pPr>
       <w:r>
         <w:rPr>
+          <w:noProof/>
           <w:lang w:val="en-US"/>
         </w:rPr>
         <w:drawing>
@@ -816,74 +668,24 @@
         </w:rPr>
         <w:t xml:space="preserve">Cluster info name : </w:t>
       </w:r>
-      <w:proofErr w:type="spellStart"/>
-      <w:r>
-        <w:rPr>
-          <w:lang w:val="en-US"/>
-        </w:rPr>
-        <w:t>vprofile</w:t>
-      </w:r>
-      <w:proofErr w:type="spellEnd"/>
-      <w:r>
-        <w:rPr>
-          <w:lang w:val="en-US"/>
-        </w:rPr>
-        <w:t>-</w:t>
-      </w:r>
-      <w:proofErr w:type="spellStart"/>
-      <w:r>
-        <w:rPr>
-          <w:lang w:val="en-US"/>
-        </w:rPr>
-        <w:t>rearch</w:t>
-      </w:r>
-      <w:proofErr w:type="spellEnd"/>
-      <w:r>
-        <w:rPr>
-          <w:lang w:val="en-US"/>
-        </w:rPr>
-        <w:t>-cache</w:t>
-      </w:r>
-    </w:p>
-    <w:p>
-      <w:pPr>
-        <w:rPr>
-          <w:lang w:val="en-US"/>
-        </w:rPr>
-      </w:pPr>
-      <w:r>
-        <w:rPr>
-          <w:lang w:val="en-US"/>
-        </w:rPr>
-        <w:t xml:space="preserve">Parameter group in Cluster setting section : </w:t>
-      </w:r>
-      <w:proofErr w:type="spellStart"/>
-      <w:r>
-        <w:rPr>
-          <w:lang w:val="en-US"/>
-        </w:rPr>
-        <w:t>vprofile</w:t>
-      </w:r>
-      <w:proofErr w:type="spellEnd"/>
-      <w:r>
-        <w:rPr>
-          <w:lang w:val="en-US"/>
-        </w:rPr>
-        <w:t>-</w:t>
-      </w:r>
-      <w:proofErr w:type="spellStart"/>
-      <w:r>
-        <w:rPr>
-          <w:lang w:val="en-US"/>
-        </w:rPr>
-        <w:t>rearch</w:t>
-      </w:r>
-      <w:proofErr w:type="spellEnd"/>
-      <w:r>
-        <w:rPr>
-          <w:lang w:val="en-US"/>
-        </w:rPr>
-        <w:t>-cache-parameter-group (created in the previous section)</w:t>
+      <w:r>
+        <w:rPr>
+          <w:lang w:val="en-US"/>
+        </w:rPr>
+        <w:t>vprofile-rearch-cache</w:t>
+      </w:r>
+    </w:p>
+    <w:p>
+      <w:pPr>
+        <w:rPr>
+          <w:lang w:val="en-US"/>
+        </w:rPr>
+      </w:pPr>
+      <w:r>
+        <w:rPr>
+          <w:lang w:val="en-US"/>
+        </w:rPr>
+        <w:t>Parameter group in Cluster setting section : vprofile-rearch-cache-parameter-group (created in the previous section)</w:t>
       </w:r>
     </w:p>
     <w:p>
@@ -916,35 +718,7 @@
           <w:lang w:val="en-US"/>
         </w:rPr>
         <w:lastRenderedPageBreak/>
-        <w:t xml:space="preserve">In the next step, in security group section, we manage and choose </w:t>
-      </w:r>
-      <w:proofErr w:type="spellStart"/>
-      <w:r>
-        <w:rPr>
-          <w:lang w:val="en-US"/>
-        </w:rPr>
-        <w:t>vprofile</w:t>
-      </w:r>
-      <w:proofErr w:type="spellEnd"/>
-      <w:r>
-        <w:rPr>
-          <w:lang w:val="en-US"/>
-        </w:rPr>
-        <w:t>-</w:t>
-      </w:r>
-      <w:proofErr w:type="spellStart"/>
-      <w:r>
-        <w:rPr>
-          <w:lang w:val="en-US"/>
-        </w:rPr>
-        <w:t>rearch</w:t>
-      </w:r>
-      <w:proofErr w:type="spellEnd"/>
-      <w:r>
-        <w:rPr>
-          <w:lang w:val="en-US"/>
-        </w:rPr>
-        <w:t>-backend-sg who is the SG of our backend</w:t>
+        <w:t>In the next step, in security group section, we manage and choose vprofile-rearch-backend-sg who is the SG of our backend</w:t>
       </w:r>
     </w:p>
     <w:p>
@@ -1003,16 +777,8 @@
         <w:rPr>
           <w:lang w:val="en-US"/>
         </w:rPr>
-        <w:t xml:space="preserve">Broker name : </w:t>
-      </w:r>
-      <w:proofErr w:type="spellStart"/>
-      <w:r>
-        <w:rPr>
-          <w:lang w:val="en-US"/>
-        </w:rPr>
-        <w:t>vprofile-rearch-rabbitmq</w:t>
-      </w:r>
-      <w:proofErr w:type="spellEnd"/>
+        <w:t>Broker name : vprofile-rearch-rabbitmq</w:t>
+      </w:r>
     </w:p>
     <w:p>
       <w:pPr>
@@ -1115,35 +881,7 @@
         <w:rPr>
           <w:lang w:val="en-US"/>
         </w:rPr>
-        <w:t xml:space="preserve">In the security group, I chose </w:t>
-      </w:r>
-      <w:proofErr w:type="spellStart"/>
-      <w:r>
-        <w:rPr>
-          <w:lang w:val="en-US"/>
-        </w:rPr>
-        <w:t>vprofile</w:t>
-      </w:r>
-      <w:proofErr w:type="spellEnd"/>
-      <w:r>
-        <w:rPr>
-          <w:lang w:val="en-US"/>
-        </w:rPr>
-        <w:t>-</w:t>
-      </w:r>
-      <w:proofErr w:type="spellStart"/>
-      <w:r>
-        <w:rPr>
-          <w:lang w:val="en-US"/>
-        </w:rPr>
-        <w:t>rearch</w:t>
-      </w:r>
-      <w:proofErr w:type="spellEnd"/>
-      <w:r>
-        <w:rPr>
-          <w:lang w:val="en-US"/>
-        </w:rPr>
-        <w:t>-backend-sg created for our backend</w:t>
+        <w:t>In the security group, I chose vprofile-rearch-backend-sg created for our backend</w:t>
       </w:r>
     </w:p>
     <w:p>
@@ -1189,91 +927,33 @@
         <w:rPr>
           <w:lang w:val="en-US"/>
         </w:rPr>
-        <w:t xml:space="preserve">After the creation of EC2 instance, we need to be connected to </w:t>
-      </w:r>
-      <w:proofErr w:type="spellStart"/>
-      <w:r>
-        <w:rPr>
-          <w:lang w:val="en-US"/>
-        </w:rPr>
-        <w:t>to</w:t>
-      </w:r>
-      <w:proofErr w:type="spellEnd"/>
-      <w:r>
-        <w:rPr>
-          <w:lang w:val="en-US"/>
-        </w:rPr>
-        <w:t xml:space="preserve"> the EC2 and make the next command to install </w:t>
-      </w:r>
-      <w:proofErr w:type="spellStart"/>
-      <w:r>
-        <w:rPr>
-          <w:lang w:val="en-US"/>
-        </w:rPr>
-        <w:t>mysql</w:t>
-      </w:r>
-      <w:proofErr w:type="spellEnd"/>
-      <w:r>
-        <w:rPr>
-          <w:lang w:val="en-US"/>
-        </w:rPr>
-        <w:t>-client and git:</w:t>
-      </w:r>
-    </w:p>
-    <w:p>
-      <w:pPr>
-        <w:rPr>
-          <w:lang w:val="en-US"/>
-        </w:rPr>
-      </w:pPr>
-      <w:proofErr w:type="spellStart"/>
-      <w:r>
-        <w:rPr>
-          <w:lang w:val="en-US"/>
-        </w:rPr>
-        <w:t>sudo</w:t>
-      </w:r>
-      <w:proofErr w:type="spellEnd"/>
-      <w:r>
-        <w:rPr>
-          <w:lang w:val="en-US"/>
-        </w:rPr>
-        <w:t xml:space="preserve"> -</w:t>
-      </w:r>
-      <w:proofErr w:type="spellStart"/>
-      <w:r>
-        <w:rPr>
-          <w:lang w:val="en-US"/>
-        </w:rPr>
-        <w:t>i</w:t>
-      </w:r>
-      <w:proofErr w:type="spellEnd"/>
-    </w:p>
-    <w:p>
-      <w:pPr>
-        <w:rPr>
-          <w:lang w:val="en-US"/>
-        </w:rPr>
-      </w:pPr>
-      <w:r>
-        <w:rPr>
-          <w:lang w:val="en-US"/>
-        </w:rPr>
-        <w:t xml:space="preserve">apt update install </w:t>
-      </w:r>
-      <w:proofErr w:type="spellStart"/>
-      <w:r>
-        <w:rPr>
-          <w:lang w:val="en-US"/>
-        </w:rPr>
-        <w:t>mysql</w:t>
-      </w:r>
-      <w:proofErr w:type="spellEnd"/>
-      <w:r>
-        <w:rPr>
-          <w:lang w:val="en-US"/>
-        </w:rPr>
-        <w:t>-client git -y</w:t>
+        <w:t>After the creation of EC2 instance, we need to be connected to to the EC2 and make the next command to install mysql-client and git:</w:t>
+      </w:r>
+    </w:p>
+    <w:p>
+      <w:pPr>
+        <w:rPr>
+          <w:lang w:val="en-US"/>
+        </w:rPr>
+      </w:pPr>
+      <w:r>
+        <w:rPr>
+          <w:lang w:val="en-US"/>
+        </w:rPr>
+        <w:t>sudo -i</w:t>
+      </w:r>
+    </w:p>
+    <w:p>
+      <w:pPr>
+        <w:rPr>
+          <w:lang w:val="en-US"/>
+        </w:rPr>
+      </w:pPr>
+      <w:r>
+        <w:rPr>
+          <w:lang w:val="en-US"/>
+        </w:rPr>
+        <w:t>apt update install mysql-client git -y</w:t>
       </w:r>
     </w:p>
     <w:p>
@@ -1312,62 +992,20 @@
         <w:rPr>
           <w:lang w:val="en-US"/>
         </w:rPr>
-        <w:t xml:space="preserve"> (endpoint of the </w:t>
-      </w:r>
-      <w:proofErr w:type="spellStart"/>
-      <w:r>
-        <w:rPr>
-          <w:lang w:val="en-US"/>
-        </w:rPr>
-        <w:t>rds</w:t>
-      </w:r>
-      <w:proofErr w:type="spellEnd"/>
-      <w:r>
-        <w:rPr>
-          <w:lang w:val="en-US"/>
-        </w:rPr>
-        <w:t>, username and password)</w:t>
-      </w:r>
-    </w:p>
-    <w:p>
-      <w:pPr>
-        <w:rPr>
-          <w:lang w:val="en-US"/>
-        </w:rPr>
-      </w:pPr>
-      <w:r>
-        <w:rPr>
-          <w:lang w:val="en-US"/>
-        </w:rPr>
-        <w:t xml:space="preserve">Allow this instance security group to talk to the RDS security group (the RDS SG is </w:t>
-      </w:r>
-      <w:proofErr w:type="spellStart"/>
-      <w:r>
-        <w:rPr>
-          <w:lang w:val="en-US"/>
-        </w:rPr>
-        <w:t>vprofile</w:t>
-      </w:r>
-      <w:proofErr w:type="spellEnd"/>
-      <w:r>
-        <w:rPr>
-          <w:lang w:val="en-US"/>
-        </w:rPr>
-        <w:t>-</w:t>
-      </w:r>
-      <w:proofErr w:type="spellStart"/>
-      <w:r>
-        <w:rPr>
-          <w:lang w:val="en-US"/>
-        </w:rPr>
-        <w:t>rearch</w:t>
-      </w:r>
-      <w:proofErr w:type="spellEnd"/>
-      <w:r>
-        <w:rPr>
-          <w:lang w:val="en-US"/>
-        </w:rPr>
-        <w:t>-backend-sg</w:t>
+        <w:t xml:space="preserve"> (endpoint of the rds, username and password)</w:t>
+      </w:r>
+    </w:p>
+    <w:p>
+      <w:pPr>
+        <w:rPr>
+          <w:lang w:val="en-US"/>
+        </w:rPr>
+      </w:pPr>
+      <w:r>
+        <w:rPr>
+          <w:lang w:val="en-US"/>
+        </w:rPr>
+        <w:t>Allow this instance security group to talk to the RDS security group (the RDS SG is vprofile-rearch-backend-sg</w:t>
       </w:r>
       <w:r>
         <w:rPr>
@@ -1387,27 +1025,86 @@
           <w:lang w:val="en-US"/>
         </w:rPr>
         <w:lastRenderedPageBreak/>
-        <w:t xml:space="preserve">Now we need to connect to the database : </w:t>
-      </w:r>
-      <w:proofErr w:type="spellStart"/>
-      <w:r>
-        <w:rPr>
-          <w:lang w:val="en-US"/>
-        </w:rPr>
-        <w:t>mysql</w:t>
-      </w:r>
-      <w:proofErr w:type="spellEnd"/>
-      <w:r>
-        <w:rPr>
-          <w:lang w:val="en-US"/>
-        </w:rPr>
-        <w:t xml:space="preserve"> -h vprofile-rds-rearch.c6doiawyq7fz.us-east-1.rds.amazonaws.com -u admin -pjipRul09CVxpceaO5bqo</w:t>
+        <w:t xml:space="preserve">Clone the source code from github : </w:t>
+      </w:r>
+      <w:hyperlink r:id="rId9" w:history="1">
+        <w:r>
+          <w:rPr>
+            <w:rStyle w:val="Lienhypertexte"/>
+            <w:lang w:val="en-US"/>
+          </w:rPr>
+          <w:t>https://github.com/Sougoumay/vprofile-deploy-beanstalk</w:t>
+        </w:r>
+      </w:hyperlink>
+      <w:r>
+        <w:rPr>
+          <w:lang w:val="en-US"/>
+        </w:rPr>
+        <w:t xml:space="preserve"> </w:t>
+      </w:r>
+    </w:p>
+    <w:p>
+      <w:pPr>
+        <w:rPr>
+          <w:lang w:val="en-US"/>
+        </w:rPr>
+      </w:pPr>
+      <w:r>
+        <w:rPr>
+          <w:lang w:val="en-US"/>
+        </w:rPr>
+        <w:t>Go in the project folder (it is vprofile-deploy-beanstalk in my case)</w:t>
+      </w:r>
+    </w:p>
+    <w:p>
+      <w:pPr>
+        <w:rPr>
+          <w:lang w:val="en-US"/>
+        </w:rPr>
+      </w:pPr>
+      <w:r>
+        <w:rPr>
+          <w:lang w:val="en-US"/>
+        </w:rPr>
+        <w:t>mysql -h vprofile-rds-rearch.c6doiawyq7fz.us-east-1.rds.amazonaws.com -u admin -pjipRul09CVxpceaO5bqo</w:t>
       </w:r>
       <w:r>
         <w:rPr>
           <w:lang w:val="en-US"/>
         </w:rPr>
         <w:t xml:space="preserve"> accounts</w:t>
+      </w:r>
+      <w:r>
+        <w:rPr>
+          <w:lang w:val="en-US"/>
+        </w:rPr>
+        <w:t xml:space="preserve"> &lt; src/resources/db_backup.sql</w:t>
+      </w:r>
+    </w:p>
+    <w:p>
+      <w:pPr>
+        <w:rPr>
+          <w:lang w:val="en-US"/>
+        </w:rPr>
+      </w:pPr>
+      <w:r>
+        <w:rPr>
+          <w:lang w:val="en-US"/>
+        </w:rPr>
+        <w:t>Delete these EC2 instance : our need is finished</w:t>
+      </w:r>
+    </w:p>
+    <w:p>
+      <w:pPr>
+        <w:rPr>
+          <w:lang w:val="en-US"/>
+        </w:rPr>
+      </w:pPr>
+      <w:r>
+        <w:rPr>
+          <w:lang w:val="en-US"/>
+        </w:rPr>
+        <w:t>Remove the sg of this instance from the SG of our RDS database</w:t>
       </w:r>
     </w:p>
     <w:p>
@@ -2172,6 +1869,7 @@
   <w:style w:type="character" w:default="1" w:styleId="Policepardfaut">
     <w:name w:val="Default Paragraph Font"/>
     <w:uiPriority w:val="1"/>
+    <w:semiHidden/>
     <w:unhideWhenUsed/>
   </w:style>
   <w:style w:type="table" w:default="1" w:styleId="TableauNormal">
@@ -2483,6 +2181,29 @@
       <w:smallCaps/>
       <w:color w:val="0F4761" w:themeColor="accent1" w:themeShade="BF"/>
       <w:spacing w:val="5"/>
+    </w:rPr>
+  </w:style>
+  <w:style w:type="character" w:styleId="Lienhypertexte">
+    <w:name w:val="Hyperlink"/>
+    <w:basedOn w:val="Policepardfaut"/>
+    <w:uiPriority w:val="99"/>
+    <w:unhideWhenUsed/>
+    <w:rsid w:val="006336AC"/>
+    <w:rPr>
+      <w:color w:val="467886" w:themeColor="hyperlink"/>
+      <w:u w:val="single"/>
+    </w:rPr>
+  </w:style>
+  <w:style w:type="character" w:styleId="Mentionnonrsolue">
+    <w:name w:val="Unresolved Mention"/>
+    <w:basedOn w:val="Policepardfaut"/>
+    <w:uiPriority w:val="99"/>
+    <w:semiHidden/>
+    <w:unhideWhenUsed/>
+    <w:rsid w:val="006336AC"/>
+    <w:rPr>
+      <w:color w:val="605E5C"/>
+      <w:shd w:val="clear" w:color="auto" w:fill="E1DFDD"/>
     </w:rPr>
   </w:style>
 </w:styles>

</xml_diff>